<commit_message>
Each class runs the syllabus series its students are examined on (M-453) (#4460)
Published from Bhatti-Foundation/maktab@3aed86364e99 (docs/directions/): changed subjects/9231 skeleton.docx; changed subjects/9231.md; changed subjects/9700.md; changed subjects/9701 skeleton.docx; changed subjects/9701.md; changed subjects/9702 skeleton.docx; changed subjects/9702.md; changed subjects/9709.md.
</commit_message>
<xml_diff>
--- a/subjects/9701 skeleton.docx
+++ b/subjects/9701 skeleton.docx
@@ -1553,7 +1553,7 @@
         <w:pStyle w:val="Heading1"/>
       </w:pPr>
       <w:r>
-        <w:t xml:space="preserve">28.2 General characteristic chemical properties of the first row of transition elements, titanium to copper</w:t>
+        <w:t xml:space="preserve">28.2 General characteristic chemical properties of the first set of transition elements, titanium to copper</w:t>
       </w:r>
     </w:p>
     <w:p>
@@ -1595,7 +1595,7 @@
         <w:pStyle w:val="Heading1"/>
       </w:pPr>
       <w:r>
-        <w:t xml:space="preserve">28.5 Stability constants, K stab</w:t>
+        <w:t xml:space="preserve">28.5 Stability constants, Kstab</w:t>
       </w:r>
     </w:p>
     <w:p>
@@ -1675,7 +1675,7 @@
         <w:pStyle w:val="Heading1"/>
       </w:pPr>
       <w:r>
-        <w:t xml:space="preserve">29.4 Optical isomerism</w:t>
+        <w:t xml:space="preserve">29.4 Isomerism: optical</w:t>
       </w:r>
     </w:p>
     <w:p>

</xml_diff>